<commit_message>
KDU: podmiana poz. 55 na aktualny tekst ustawy o lekarzach
</commit_message>
<xml_diff>
--- a/2026/KrDzU2026poz55.docx
+++ b/2026/KrDzU2026poz55.docx
@@ -1310,52 +1310,22 @@
           <w:i w:val="0"/>
           <w:sz w:val="22"/>
         </w:rPr>
-        <w:t>1. PWZ stwierdza w imieniu Rady jej trzyosobowy skład orzeczniczy w drodze decyzji administracyjnej. Do powoływania i działania składu stosuje się art. 45 ust. 1 zdanie pierwsze, ust. 2 i 2a–2d.</w:t>
-      </w:r>
-    </w:p>
-    <w:p>
-      <w:pPr>
-        <w:spacing w:before="0" w:after="0" w:line="360" w:lineRule="auto"/>
-        <w:jc w:val="both"/>
-      </w:pPr>
-      <w:r>
-        <w:rPr>
-          <w:rFonts w:ascii="Times New Roman" w:hAnsi="Times New Roman" w:eastAsia="Times New Roman" w:cs="Times New Roman"/>
-          <w:b w:val="0"/>
-          <w:i w:val="0"/>
-          <w:sz w:val="22"/>
-        </w:rPr>
-        <w:t>2. Decyzja o odmowie stwierdzenia PWZ zawiera uzasadnienie i pouczenie o odwołaniu.</w:t>
-      </w:r>
-    </w:p>
-    <w:p>
-      <w:pPr>
-        <w:spacing w:before="0" w:after="0" w:line="360" w:lineRule="auto"/>
-        <w:jc w:val="both"/>
-      </w:pPr>
-      <w:r>
-        <w:rPr>
-          <w:rFonts w:ascii="Times New Roman" w:hAnsi="Times New Roman" w:eastAsia="Times New Roman" w:cs="Times New Roman"/>
-          <w:b w:val="0"/>
-          <w:i w:val="0"/>
-          <w:sz w:val="22"/>
-        </w:rPr>
-        <w:t>3. Od decyzji składu orzeczniczego przysługuje odwołanie do Rady w pełnym składzie na zasadach art. 45 ust. 9–12; od decyzji Rady — skarga do Koronnego Trybunału Administracyjnego.</w:t>
-      </w:r>
-    </w:p>
-    <w:p>
-      <w:pPr>
-        <w:spacing w:before="0" w:after="0" w:line="360" w:lineRule="auto"/>
-        <w:jc w:val="both"/>
-      </w:pPr>
-      <w:r>
-        <w:rPr>
-          <w:rFonts w:ascii="Times New Roman" w:hAnsi="Times New Roman" w:eastAsia="Times New Roman" w:cs="Times New Roman"/>
-          <w:b w:val="0"/>
-          <w:i w:val="0"/>
-          <w:sz w:val="22"/>
-        </w:rPr>
-        <w:t>4. Rada prowadzi postępowanie na podstawie Kodeksu postępowania administracyjnego.</w:t>
+        <w:t>1. PWZ stwierdza w drodze decyzji administracyjnej organ Rady właściwy zgodnie z art. 45 ust. 1–3.</w:t>
+      </w:r>
+    </w:p>
+    <w:p>
+      <w:pPr>
+        <w:spacing w:before="0" w:after="0" w:line="360" w:lineRule="auto"/>
+        <w:jc w:val="both"/>
+      </w:pPr>
+      <w:r>
+        <w:rPr>
+          <w:rFonts w:ascii="Times New Roman" w:hAnsi="Times New Roman" w:eastAsia="Times New Roman" w:cs="Times New Roman"/>
+          <w:b w:val="0"/>
+          <w:i w:val="0"/>
+          <w:sz w:val="22"/>
+        </w:rPr>
+        <w:t>2. Postępowanie w sprawach PWZ prowadzi się na podstawie Koronnego Kodeksu Postępowania Administracyjnego.</w:t>
       </w:r>
     </w:p>
     <w:p>
@@ -2726,7 +2696,7 @@
           <w:i w:val="0"/>
           <w:sz w:val="22"/>
         </w:rPr>
-        <w:t>2. Trzyosobowy skład orzeczniczy Rady zawiesza PWZ w drodze decyzji administracyjnej, z zastrzeżeniem uznaniowego charakteru zawieszenia na podstawie art. 20 ust. 3, w razie:</w:t>
+        <w:t>2. Organ Rady właściwy zgodnie z art. 45 ust. 1–3 zawiesza PWZ w drodze decyzji administracyjnej, z zastrzeżeniem uznaniowego charakteru zawieszenia na podstawie art. 20 ust. 3, w razie:</w:t>
       </w:r>
     </w:p>
     <w:p>
@@ -2816,7 +2786,7 @@
           <w:i w:val="0"/>
           <w:sz w:val="22"/>
         </w:rPr>
-        <w:t>4. Do składu orzeczniczego stosuje się art. 45 ust. 1 zdanie pierwsze, ust. 2 i 2a–2d. Od decyzji przysługuje odwołanie do Rady w pełnym składzie na zasadach art. 45 ust. 9–12, a następnie skarga do Koronnego Trybunału Administracyjnego.</w:t>
+        <w:t>4. Do postępowania w sprawach zawieszenia PWZ stosuje się Koronny Kodeks Postępowania Administracyjnego.</w:t>
       </w:r>
     </w:p>
     <w:p>
@@ -3662,7 +3632,7 @@
           <w:i w:val="0"/>
           <w:sz w:val="22"/>
         </w:rPr>
-        <w:t>1. Przewodniczący Rady reprezentuje Radę, zwołuje posiedzenia, prowadzi obrady, podpisuje uchwały oraz wykonuje inne zadania określone ustawą.</w:t>
+        <w:t>1. Przewodniczący Rady reprezentuje Radę, zwołuje posiedzenia, prowadzi obrady, podpisuje uchwały inne niż rozstrzygnięcia spraw indywidualnych oraz wykonuje inne zadania określone ustawą.</w:t>
       </w:r>
     </w:p>
     <w:p>
@@ -3833,7 +3803,7 @@
           <w:i w:val="0"/>
           <w:sz w:val="22"/>
         </w:rPr>
-        <w:t>4. Rada podejmuje uchwały zwykłą większością głosów w obecności co najmniej 6 członków, w tym Przewodniczącego lub Wiceprzewodniczącego, z zastrzeżeniem szczególnych zasad orzekania w sprawach indywidualnych określonych w art. 45.</w:t>
+        <w:t>4. Rada podejmuje uchwały zwykłą większością głosów w obecności co najmniej 6 członków, w tym Przewodniczącego lub Wiceprzewodniczącego. Kworum to nie dotyczy trzyosobowego składu orzeczniczego, o którym mowa w art. 45 ust. 1.</w:t>
       </w:r>
     </w:p>
     <w:p>
@@ -3986,22 +3956,22 @@
           <w:i w:val="0"/>
           <w:sz w:val="22"/>
         </w:rPr>
-        <w:t>3. Uchwała zawiera podstawę prawną, rozstrzygnięcie, uzasadnienie i datę wejścia w życie.</w:t>
-      </w:r>
-    </w:p>
-    <w:p>
-      <w:pPr>
-        <w:spacing w:before="0" w:after="0" w:line="360" w:lineRule="auto"/>
-        <w:jc w:val="both"/>
-      </w:pPr>
-      <w:r>
-        <w:rPr>
-          <w:rFonts w:ascii="Times New Roman" w:hAnsi="Times New Roman" w:eastAsia="Times New Roman" w:cs="Times New Roman"/>
-          <w:b w:val="0"/>
-          <w:i w:val="0"/>
-          <w:sz w:val="22"/>
-        </w:rPr>
-        <w:t>4. Uchwała wchodzi w życie po upływie 14 dni od ogłoszenia, chyba że sama stanowi inaczej; uchwała w sprawie choroby publicznej może wejść w życie natychmiast, jeżeli Rada wskaże pilny interes zdrowia publicznego. Skuteczność i wykonalność uchwał w sprawach zdrowia indywidualnego określa Koronny Kodeks Postępowania Administracyjnego; ogłoszenie wersji zanonimizowanej w Monitorze Krulewskim nie zastępuje doręczenia stronie i nie rozpoczyna biegu terminów zaskarżenia.</w:t>
+        <w:t>3. Uchwała inna niż rozstrzygnięcie sprawy indywidualnej zawiera podstawę prawną, rozstrzygnięcie, uzasadnienie i datę wejścia w życie. Wymagania dotyczące rozstrzygnięć spraw indywidualnych określa Koronny Kodeks Postępowania Administracyjnego.</w:t>
+      </w:r>
+    </w:p>
+    <w:p>
+      <w:pPr>
+        <w:spacing w:before="0" w:after="0" w:line="360" w:lineRule="auto"/>
+        <w:jc w:val="both"/>
+      </w:pPr>
+      <w:r>
+        <w:rPr>
+          <w:rFonts w:ascii="Times New Roman" w:hAnsi="Times New Roman" w:eastAsia="Times New Roman" w:cs="Times New Roman"/>
+          <w:b w:val="0"/>
+          <w:i w:val="0"/>
+          <w:sz w:val="22"/>
+        </w:rPr>
+        <w:t>4. Uchwała inna niż rozstrzygnięcie sprawy indywidualnej wchodzi w życie po upływie 14 dni od ogłoszenia, chyba że sama stanowi inaczej; uchwała w sprawie choroby publicznej może wejść w życie natychmiast, jeżeli Rada wskaże pilny interes zdrowia publicznego. Do skutków rozstrzygnięć spraw indywidualnych stosuje się Koronny Kodeks Postępowania Administracyjnego.</w:t>
       </w:r>
     </w:p>
     <w:p>
@@ -5327,217 +5297,82 @@
           <w:i w:val="0"/>
           <w:sz w:val="22"/>
         </w:rPr>
-        <w:t>1. Uchwałę w sprawie zdrowia indywidualnego wydaje w imieniu Rady trzyosobowy skład orzeczniczy, obejmujący co najmniej jednego lekarza i jednego lekarza dentystę, wyznaczony spośród członków Rady przez jej Przewodniczącego do konkretnej sprawy. Postępowanie wszczyna się na wniosek:</w:t>
-      </w:r>
-    </w:p>
-    <w:p>
-      <w:pPr>
-        <w:spacing w:before="0" w:after="0" w:line="360" w:lineRule="auto"/>
-        <w:jc w:val="both"/>
-      </w:pPr>
-      <w:r>
-        <w:rPr>
-          <w:rFonts w:ascii="Times New Roman" w:hAnsi="Times New Roman" w:eastAsia="Times New Roman" w:cs="Times New Roman"/>
-          <w:b w:val="0"/>
-          <w:i w:val="0"/>
-          <w:sz w:val="22"/>
-        </w:rPr>
-        <w:t>1) pacjenta;</w:t>
-      </w:r>
-    </w:p>
-    <w:p>
-      <w:pPr>
-        <w:spacing w:before="0" w:after="0" w:line="360" w:lineRule="auto"/>
-        <w:jc w:val="both"/>
-      </w:pPr>
-      <w:r>
-        <w:rPr>
-          <w:rFonts w:ascii="Times New Roman" w:hAnsi="Times New Roman" w:eastAsia="Times New Roman" w:cs="Times New Roman"/>
-          <w:b w:val="0"/>
-          <w:i w:val="0"/>
-          <w:sz w:val="22"/>
-        </w:rPr>
-        <w:t>2) lekarza lub lekarza dentysty;</w:t>
-      </w:r>
-    </w:p>
-    <w:p>
-      <w:pPr>
-        <w:spacing w:before="0" w:after="0" w:line="360" w:lineRule="auto"/>
-        <w:jc w:val="both"/>
-      </w:pPr>
-      <w:r>
-        <w:rPr>
-          <w:rFonts w:ascii="Times New Roman" w:hAnsi="Times New Roman" w:eastAsia="Times New Roman" w:cs="Times New Roman"/>
-          <w:b w:val="0"/>
-          <w:i w:val="0"/>
-          <w:sz w:val="22"/>
-        </w:rPr>
-        <w:t>3) Senatu, Krula, ministra zdrowia;</w:t>
-      </w:r>
-    </w:p>
-    <w:p>
-      <w:pPr>
-        <w:spacing w:before="0" w:after="0" w:line="360" w:lineRule="auto"/>
-        <w:jc w:val="both"/>
-      </w:pPr>
-      <w:r>
-        <w:rPr>
-          <w:rFonts w:ascii="Times New Roman" w:hAnsi="Times New Roman" w:eastAsia="Times New Roman" w:cs="Times New Roman"/>
-          <w:b w:val="0"/>
-          <w:i w:val="0"/>
-          <w:sz w:val="22"/>
-        </w:rPr>
-        <w:t>4) Rzecznika Praw Obywatelskich;</w:t>
-      </w:r>
-    </w:p>
-    <w:p>
-      <w:pPr>
-        <w:spacing w:before="0" w:after="0" w:line="360" w:lineRule="auto"/>
-        <w:jc w:val="both"/>
-      </w:pPr>
-      <w:r>
-        <w:rPr>
-          <w:rFonts w:ascii="Times New Roman" w:hAnsi="Times New Roman" w:eastAsia="Times New Roman" w:cs="Times New Roman"/>
-          <w:b w:val="0"/>
-          <w:i w:val="0"/>
-          <w:sz w:val="22"/>
-        </w:rPr>
-        <w:t>5) Koronnej Izby Kontroli.</w:t>
-      </w:r>
-    </w:p>
-    <w:p>
-      <w:pPr>
-        <w:spacing w:before="0" w:after="0" w:line="360" w:lineRule="auto"/>
-        <w:jc w:val="both"/>
-      </w:pPr>
-      <w:r>
-        <w:rPr>
-          <w:rFonts w:ascii="Times New Roman" w:hAnsi="Times New Roman" w:eastAsia="Times New Roman" w:cs="Times New Roman"/>
-          <w:b w:val="0"/>
-          <w:i w:val="0"/>
-          <w:sz w:val="22"/>
-        </w:rPr>
-        <w:t>2. Wyznaczając skład orzeczniczy, Przewodniczący Rady wskazuje przewodniczącego tego składu. Rozstrzygnięcie wymaga udziału wszystkich trzech członków i zapada zwykłą większością głosów; podpisują je wszyscy członkowie składu. Nie stosuje się art. 30 ust. 1 w zakresie podpisywania rozstrzygnięcia ani art. 32 ust. 4–6.</w:t>
-      </w:r>
-    </w:p>
-    <w:p>
-      <w:pPr>
-        <w:spacing w:before="0" w:after="0" w:line="360" w:lineRule="auto"/>
-        <w:jc w:val="both"/>
-      </w:pPr>
-      <w:r>
-        <w:rPr>
-          <w:rFonts w:ascii="Times New Roman" w:hAnsi="Times New Roman" w:eastAsia="Times New Roman" w:cs="Times New Roman"/>
-          <w:b w:val="0"/>
-          <w:i w:val="0"/>
-          <w:sz w:val="22"/>
-        </w:rPr>
-        <w:t>2a. Członek Rady podlega wyłączeniu od rozpoznania sprawy, jeżeli zachodzą okoliczności wywołujące uzasadnione wątpliwości co do jego bezstronności, w szczególności konflikt interesów określony w art. 28 ust. 3. Wyłączenie obejmuje także członków składu, który wydał rozstrzygnięcie zaskarżone odwołaniem.</w:t>
-      </w:r>
-    </w:p>
-    <w:p>
-      <w:pPr>
-        <w:spacing w:before="0" w:after="0" w:line="360" w:lineRule="auto"/>
-        <w:jc w:val="both"/>
-      </w:pPr>
-      <w:r>
-        <w:rPr>
-          <w:rFonts w:ascii="Times New Roman" w:hAnsi="Times New Roman" w:eastAsia="Times New Roman" w:cs="Times New Roman"/>
-          <w:b w:val="0"/>
-          <w:i w:val="0"/>
-          <w:sz w:val="22"/>
-        </w:rPr>
-        <w:t>2b. O wyłączeniu członka składu i wyznaczeniu w jego miejsce innego uprawnionego członka Rady rozstrzyga Przewodniczący Rady; o wyłączeniu Przewodniczącego Rady rozstrzyga niewyłączony Wiceprzewodniczący, a w braku takiej osoby — Rada bez udziału osoby, której wyłączenie dotyczy.</w:t>
-      </w:r>
-    </w:p>
-    <w:p>
-      <w:pPr>
-        <w:spacing w:before="0" w:after="0" w:line="360" w:lineRule="auto"/>
-        <w:jc w:val="both"/>
-      </w:pPr>
-      <w:r>
-        <w:rPr>
-          <w:rFonts w:ascii="Times New Roman" w:hAnsi="Times New Roman" w:eastAsia="Times New Roman" w:cs="Times New Roman"/>
-          <w:b w:val="0"/>
-          <w:i w:val="0"/>
-          <w:sz w:val="22"/>
-        </w:rPr>
-        <w:t>2c. W razie wyłączenia albo nieobecności Przewodniczącego Rady zadania związane z wyznaczeniem składu wykonuje niewyłączony Wiceprzewodniczący; jeżeli obaj Wiceprzewodniczący również nie mogą działać, zadania te wykonuje najstarszy wiekiem uprawniony członek Rady. Osoba ta nie rozstrzyga o własnym wyłączeniu.</w:t>
-      </w:r>
-    </w:p>
-    <w:p>
-      <w:pPr>
-        <w:spacing w:before="0" w:after="0" w:line="360" w:lineRule="auto"/>
-        <w:jc w:val="both"/>
-      </w:pPr>
-      <w:r>
-        <w:rPr>
-          <w:rFonts w:ascii="Times New Roman" w:hAnsi="Times New Roman" w:eastAsia="Times New Roman" w:cs="Times New Roman"/>
-          <w:b w:val="0"/>
-          <w:i w:val="0"/>
-          <w:sz w:val="22"/>
-        </w:rPr>
-        <w:t>2d. Wakat lub wyłączenie nie uprawnia do orzekania w składzie mniejszym niż trzy osoby. Jeżeli nie można wyznaczyć składu spełniającego wymagania ust. 1, zawiadamia się stronę o przyczynie zwłoki i podejmuje czynności niezbędne do usunięcia przeszkody, a w razie wakatu — zawiadamia Senat o konieczności uzupełnienia składu Rady. Zachowuje się prawo strony do zaskarżenia bezczynności lub przewlekłości na zasadach ogólnych.</w:t>
-      </w:r>
-    </w:p>
-    <w:p>
-      <w:pPr>
-        <w:spacing w:before="0" w:after="0" w:line="360" w:lineRule="auto"/>
-        <w:jc w:val="both"/>
-      </w:pPr>
-      <w:r>
-        <w:rPr>
-          <w:rFonts w:ascii="Times New Roman" w:hAnsi="Times New Roman" w:eastAsia="Times New Roman" w:cs="Times New Roman"/>
-          <w:b w:val="0"/>
-          <w:i w:val="0"/>
-          <w:sz w:val="22"/>
-        </w:rPr>
-        <w:t>3. Uchwała wymaga zgody osoby, której dotyczy, chyba że ustawa stanowi inaczej; w sprawie choroby publicznej badanie może być zarządzone na podstawie ustawy.</w:t>
-      </w:r>
-    </w:p>
-    <w:p>
-      <w:pPr>
-        <w:spacing w:before="0" w:after="0" w:line="360" w:lineRule="auto"/>
-        <w:jc w:val="both"/>
-      </w:pPr>
-      <w:r>
-        <w:rPr>
-          <w:rFonts w:ascii="Times New Roman" w:hAnsi="Times New Roman" w:eastAsia="Times New Roman" w:cs="Times New Roman"/>
-          <w:b w:val="0"/>
-          <w:i w:val="0"/>
-          <w:sz w:val="22"/>
-        </w:rPr>
-        <w:t>4. Uchwała stwierdza, czy osoba jest chora, wskazuje chorobę, jej przyczynę medyczną, zalecane postępowanie i rokowanie.</w:t>
-      </w:r>
-    </w:p>
-    <w:p>
-      <w:pPr>
-        <w:spacing w:before="0" w:after="0" w:line="360" w:lineRule="auto"/>
-        <w:jc w:val="both"/>
-      </w:pPr>
-      <w:r>
-        <w:rPr>
-          <w:rFonts w:ascii="Times New Roman" w:hAnsi="Times New Roman" w:eastAsia="Times New Roman" w:cs="Times New Roman"/>
-          <w:b w:val="0"/>
-          <w:i w:val="0"/>
-          <w:sz w:val="22"/>
-        </w:rPr>
-        <w:t>5. Uchwała opiera się wyłącznie na kryteriach medycznych, dowodach i opiniach biegłych; nie może być oparta na przesłankach politycznych, moralnych, religijnych, rasowych lub społecznych.</w:t>
-      </w:r>
-    </w:p>
-    <w:p>
-      <w:pPr>
-        <w:spacing w:before="0" w:after="0" w:line="360" w:lineRule="auto"/>
-        <w:jc w:val="both"/>
-      </w:pPr>
-      <w:r>
-        <w:rPr>
-          <w:rFonts w:ascii="Times New Roman" w:hAnsi="Times New Roman" w:eastAsia="Times New Roman" w:cs="Times New Roman"/>
-          <w:b w:val="0"/>
-          <w:i w:val="0"/>
-          <w:sz w:val="22"/>
-        </w:rPr>
-        <w:t>6. Przed wydaniem uchwały osoba ma prawo do wysłuchania, przedstawienia dowodów i ustanowienia pełnomocnika.</w:t>
+        <w:t>1. Organem Rady właściwym do rozstrzygania spraw indywidualnych w pierwszej instancji, w tym spraw PWZ, zawieszenia PWZ i zdrowia indywidualnego, jest trzyosobowy skład orzeczniczy Rady, z zastrzeżeniem art. 53.</w:t>
+      </w:r>
+    </w:p>
+    <w:p>
+      <w:pPr>
+        <w:spacing w:before="0" w:after="0" w:line="360" w:lineRule="auto"/>
+        <w:jc w:val="both"/>
+      </w:pPr>
+      <w:r>
+        <w:rPr>
+          <w:rFonts w:ascii="Times New Roman" w:hAnsi="Times New Roman" w:eastAsia="Times New Roman" w:cs="Times New Roman"/>
+          <w:b w:val="0"/>
+          <w:i w:val="0"/>
+          <w:sz w:val="22"/>
+        </w:rPr>
+        <w:t>2. Skład orzeczniczy obejmuje co najmniej jednego lekarza i jednego lekarza dentystę. Członków składu oraz jego przewodniczącego wyznacza spośród członków Rady Przewodniczący Rady.</w:t>
+      </w:r>
+    </w:p>
+    <w:p>
+      <w:pPr>
+        <w:spacing w:before="0" w:after="0" w:line="360" w:lineRule="auto"/>
+        <w:jc w:val="both"/>
+      </w:pPr>
+      <w:r>
+        <w:rPr>
+          <w:rFonts w:ascii="Times New Roman" w:hAnsi="Times New Roman" w:eastAsia="Times New Roman" w:cs="Times New Roman"/>
+          <w:b w:val="0"/>
+          <w:i w:val="0"/>
+          <w:sz w:val="22"/>
+        </w:rPr>
+        <w:t>3. Organem wyższego stopnia wobec składu orzeczniczego, w rozumieniu Koronnego Kodeksu Postępowania Administracyjnego, jest Rada w pełnym składzie.</w:t>
+      </w:r>
+    </w:p>
+    <w:p>
+      <w:pPr>
+        <w:spacing w:before="0" w:after="0" w:line="360" w:lineRule="auto"/>
+        <w:jc w:val="both"/>
+      </w:pPr>
+      <w:r>
+        <w:rPr>
+          <w:rFonts w:ascii="Times New Roman" w:hAnsi="Times New Roman" w:eastAsia="Times New Roman" w:cs="Times New Roman"/>
+          <w:b w:val="0"/>
+          <w:i w:val="0"/>
+          <w:sz w:val="22"/>
+        </w:rPr>
+        <w:t>4. Do postępowań przed organami Rady oraz sądowej kontroli ich rozstrzygnięć stosuje się Koronny Kodeks Postępowania Administracyjnego.</w:t>
+      </w:r>
+    </w:p>
+    <w:p>
+      <w:pPr>
+        <w:spacing w:before="0" w:after="0" w:line="360" w:lineRule="auto"/>
+        <w:jc w:val="both"/>
+      </w:pPr>
+      <w:r>
+        <w:rPr>
+          <w:rFonts w:ascii="Times New Roman" w:hAnsi="Times New Roman" w:eastAsia="Times New Roman" w:cs="Times New Roman"/>
+          <w:b w:val="0"/>
+          <w:i w:val="0"/>
+          <w:sz w:val="22"/>
+        </w:rPr>
+        <w:t>5. Uchwała w sprawie zdrowia indywidualnego stwierdza, czy osoba jest chora, wskazuje chorobę, jej przyczynę medyczną, zalecane postępowanie i rokowanie.</w:t>
+      </w:r>
+    </w:p>
+    <w:p>
+      <w:pPr>
+        <w:spacing w:before="0" w:after="0" w:line="360" w:lineRule="auto"/>
+        <w:jc w:val="both"/>
+      </w:pPr>
+      <w:r>
+        <w:rPr>
+          <w:rFonts w:ascii="Times New Roman" w:hAnsi="Times New Roman" w:eastAsia="Times New Roman" w:cs="Times New Roman"/>
+          <w:b w:val="0"/>
+          <w:i w:val="0"/>
+          <w:sz w:val="22"/>
+        </w:rPr>
+        <w:t>6. Uchwała opiera się wyłącznie na kryteriach medycznych; nie może być oparta na przesłankach politycznych, moralnych, religijnych, rasowych lub społecznych.</w:t>
       </w:r>
     </w:p>
     <w:p>
@@ -5582,52 +5417,7 @@
           <w:i w:val="0"/>
           <w:sz w:val="22"/>
         </w:rPr>
-        <w:t>9. Od rozstrzygnięcia składu orzeczniczego przysługuje odwołanie do Rady w pełnym składzie w terminie 14 dni od doręczenia rozstrzygnięcia stronie. Odwołanie wnosi się za pośrednictwem składu, który wydał rozstrzygnięcie; stosuje się odpowiednio przepisy Koronnego Kodeksu Postępowania Administracyjnego o odwołaniach, w tym o wstrzymaniu wykonania rozstrzygnięcia.</w:t>
-      </w:r>
-    </w:p>
-    <w:p>
-      <w:pPr>
-        <w:spacing w:before="0" w:after="0" w:line="360" w:lineRule="auto"/>
-        <w:jc w:val="both"/>
-      </w:pPr>
-      <w:r>
-        <w:rPr>
-          <w:rFonts w:ascii="Times New Roman" w:hAnsi="Times New Roman" w:eastAsia="Times New Roman" w:cs="Times New Roman"/>
-          <w:b w:val="0"/>
-          <w:i w:val="0"/>
-          <w:sz w:val="22"/>
-        </w:rPr>
-        <w:t>10. Pełny skład oznacza posiedzenie plenarne Rady, na które wzywa się wszystkich jej członków uprawnionych do rozpoznania odwołania, a nie wyodrębniony zespół odwoławczy. W orzekaniu nie uczestniczą członkowie wyłączeni na podstawie ust. 2a, w tym osoby, które wydały zaskarżone rozstrzygnięcie.</w:t>
-      </w:r>
-    </w:p>
-    <w:p>
-      <w:pPr>
-        <w:spacing w:before="0" w:after="0" w:line="360" w:lineRule="auto"/>
-        <w:jc w:val="both"/>
-      </w:pPr>
-      <w:r>
-        <w:rPr>
-          <w:rFonts w:ascii="Times New Roman" w:hAnsi="Times New Roman" w:eastAsia="Times New Roman" w:cs="Times New Roman"/>
-          <w:b w:val="0"/>
-          <w:i w:val="0"/>
-          <w:sz w:val="22"/>
-        </w:rPr>
-        <w:t>11. Rada rozpoznaje odwołanie przy udziale co najmniej sześciu niewyłączonych członków, zwykłą większością głosów; w razie równej liczby głosów rozstrzygnięcie nie zapada. Posiedzeniu przewodniczy niewyłączony Przewodniczący Rady lub Wiceprzewodniczący, a w braku takiej osoby — niewyłączony członek wybrany przez uczestniczących członków. Rozstrzygnięcie podpisują wszyscy uczestniczący w jego wydaniu; nie stosuje się art. 30 ust. 1 w zakresie podpisywania rozstrzygnięcia ani art. 32 ust. 4–6.</w:t>
-      </w:r>
-    </w:p>
-    <w:p>
-      <w:pPr>
-        <w:spacing w:before="0" w:after="0" w:line="360" w:lineRule="auto"/>
-        <w:jc w:val="both"/>
-      </w:pPr>
-      <w:r>
-        <w:rPr>
-          <w:rFonts w:ascii="Times New Roman" w:hAnsi="Times New Roman" w:eastAsia="Times New Roman" w:cs="Times New Roman"/>
-          <w:b w:val="0"/>
-          <w:i w:val="0"/>
-          <w:sz w:val="22"/>
-        </w:rPr>
-        <w:t>12. W razie braku kworum wskutek wakatu lub wyłączenia odwołania nie przekazuje się składowi trzyosobowemu ani innemu organowi. Stosuje się odpowiednio ust. 2d. Od rozstrzygnięcia Rady kończącego postępowanie odwoławcze przysługuje skarga do Koronnego Trybunału Administracyjnego na zasadach Koronnego Kodeksu Postępowania Administracyjnego.</w:t>
+        <w:t>9. Wydanie uchwały w sprawie zdrowia indywidualnego wymaga zgody osoby, której dotyczy, chyba że ustawa stanowi inaczej; badanie bez zgody może nastąpić wyłącznie na podstawie ustawy.</w:t>
       </w:r>
     </w:p>
     <w:p>
@@ -6263,7 +6053,7 @@
           <w:i w:val="0"/>
           <w:sz w:val="22"/>
         </w:rPr>
-        <w:t>2. Rzecznik prowadzi postępowanie wyjaśniające, może przesłuchiwać, żądać dokumentów i zasięgać opinii biegłych.</w:t>
+        <w:t>2. Rzecznik prowadzi postępowanie wyjaśniające na podstawie Koronnego Kodeksu Postępowania Administracyjnego.</w:t>
       </w:r>
     </w:p>
     <w:p>
@@ -6293,7 +6083,7 @@
           <w:i w:val="0"/>
           <w:sz w:val="22"/>
         </w:rPr>
-        <w:t>4. Obwiniony ma prawo do obrony, wglądu w akta i pełnomocnika.</w:t>
+        <w:t>4. Do postępowania w sprawach odpowiedzialności zawodowej stosuje się Koronny Kodeks Postępowania Administracyjnego.</w:t>
       </w:r>
     </w:p>
     <w:p>
@@ -6356,22 +6146,7 @@
           <w:i w:val="0"/>
           <w:sz w:val="22"/>
         </w:rPr>
-        <w:t>3. Sąd rozpatruje sprawę na rozprawie; stosuje się odpowiednio Kodeks postępowania administracyjnego.</w:t>
-      </w:r>
-    </w:p>
-    <w:p>
-      <w:pPr>
-        <w:spacing w:before="0" w:after="0" w:line="360" w:lineRule="auto"/>
-        <w:jc w:val="both"/>
-      </w:pPr>
-      <w:r>
-        <w:rPr>
-          <w:rFonts w:ascii="Times New Roman" w:hAnsi="Times New Roman" w:eastAsia="Times New Roman" w:cs="Times New Roman"/>
-          <w:b w:val="0"/>
-          <w:i w:val="0"/>
-          <w:sz w:val="22"/>
-        </w:rPr>
-        <w:t>4. Orzeczenie zawiera rozstrzygnięcie, uzasadnienie i pouczenie o odwołaniu.</w:t>
+        <w:t>3. Postępowanie przed Koronnym Sądem Lekarskim prowadzi się na podstawie Koronnego Kodeksu Postępowania Administracyjnego.</w:t>
       </w:r>
     </w:p>
     <w:p>
@@ -6527,37 +6302,7 @@
           <w:i w:val="0"/>
           <w:sz w:val="22"/>
         </w:rPr>
-        <w:t>1. Od orzeczenia Koronnego Sądu Lekarskiego przysługuje skarga do Koronnego Trybunału Administracyjnego w terminie 30 dni.</w:t>
-      </w:r>
-    </w:p>
-    <w:p>
-      <w:pPr>
-        <w:spacing w:before="0" w:after="0" w:line="360" w:lineRule="auto"/>
-        <w:jc w:val="both"/>
-      </w:pPr>
-      <w:r>
-        <w:rPr>
-          <w:rFonts w:ascii="Times New Roman" w:hAnsi="Times New Roman" w:eastAsia="Times New Roman" w:cs="Times New Roman"/>
-          <w:b w:val="0"/>
-          <w:i w:val="0"/>
-          <w:sz w:val="22"/>
-        </w:rPr>
-        <w:t>2. Skargę rozpatruje się na rozprawie; stosuje się przepisy o postępowaniu przed Koronnym Trybunałem Administracyjnym.</w:t>
-      </w:r>
-    </w:p>
-    <w:p>
-      <w:pPr>
-        <w:spacing w:before="0" w:after="0" w:line="360" w:lineRule="auto"/>
-        <w:jc w:val="both"/>
-      </w:pPr>
-      <w:r>
-        <w:rPr>
-          <w:rFonts w:ascii="Times New Roman" w:hAnsi="Times New Roman" w:eastAsia="Times New Roman" w:cs="Times New Roman"/>
-          <w:b w:val="0"/>
-          <w:i w:val="0"/>
-          <w:sz w:val="22"/>
-        </w:rPr>
-        <w:t>3. Skargę rozpoznaje Izba Rozpoznawcza Koronnego Trybunału Administracyjnego. Od jej orzeczenia przysługują środki zaskarżenia do Kapituły Kasacyjnej na zasadach Koronnego Kodeksu Postępowania Administracyjnego. Prawomocność orzeczeń oraz nadzwyczajny arbitraż Krula określają przepisy tego kodeksu.</w:t>
+        <w:t>Orzeczenia Koronnego Sądu Lekarskiego podlegają kontroli Koronnego Trybunału Administracyjnego na zasadach określonych w Koronnym Kodeksie Postępowania Administracyjnego.</w:t>
       </w:r>
     </w:p>
     <w:p>
@@ -6605,22 +6350,22 @@
           <w:i w:val="0"/>
           <w:sz w:val="22"/>
         </w:rPr>
-        <w:t>2. Zawieszenie stanowiące zabezpieczenie na czas postępowania dyscyplinarnego nie może trwać dłużej niż 12 miesięcy, chyba że Koronny Trybunał Administracyjny, na uzasadniony wniosek Rady i po umożliwieniu stronie zajęcia stanowiska, przedłuży je na czas oznaczony ze względu na utrzymujące się bezpośrednie zagrożenie dla pacjentów. Jest to szczególny limit wobec art. 23 ust. 3; nie dotyczy kary zawieszenia PWZ orzeczonej na podstawie art. 54.</w:t>
-      </w:r>
-    </w:p>
-    <w:p>
-      <w:pPr>
-        <w:spacing w:before="0" w:after="0" w:line="360" w:lineRule="auto"/>
-        <w:jc w:val="both"/>
-      </w:pPr>
-      <w:r>
-        <w:rPr>
-          <w:rFonts w:ascii="Times New Roman" w:hAnsi="Times New Roman" w:eastAsia="Times New Roman" w:cs="Times New Roman"/>
-          <w:b w:val="0"/>
-          <w:i w:val="0"/>
-          <w:sz w:val="22"/>
-        </w:rPr>
-        <w:t>3. Od decyzji o zawieszeniu przysługuje odwołanie do Rady w pełnym składzie na zasadach art. 45 ust. 9–12, a następnie skarga do Koronnego Trybunału Administracyjnego.</w:t>
+        <w:t>2. Zawieszenie stanowiące zabezpieczenie na czas postępowania dyscyplinarnego nie może trwać dłużej niż 12 miesięcy, chyba że Koronny Trybunał Administracyjny przedłuży je na czas oznaczony ze względu na utrzymujące się bezpośrednie zagrożenie dla pacjentów. Jest to szczególny limit wobec art. 23 ust. 3; nie dotyczy kary zawieszenia PWZ orzeczonej na podstawie art. 54.</w:t>
+      </w:r>
+    </w:p>
+    <w:p>
+      <w:pPr>
+        <w:spacing w:before="0" w:after="0" w:line="360" w:lineRule="auto"/>
+        <w:jc w:val="both"/>
+      </w:pPr>
+      <w:r>
+        <w:rPr>
+          <w:rFonts w:ascii="Times New Roman" w:hAnsi="Times New Roman" w:eastAsia="Times New Roman" w:cs="Times New Roman"/>
+          <w:b w:val="0"/>
+          <w:i w:val="0"/>
+          <w:sz w:val="22"/>
+        </w:rPr>
+        <w:t>3. Do postępowania w sprawie zawieszenia i sądowej kontroli rozstrzygnięć stosuje się Koronny Kodeks Postępowania Administracyjnego.</w:t>
       </w:r>
     </w:p>
     <w:p>
@@ -7058,7 +6803,7 @@
           <w:i w:val="0"/>
           <w:sz w:val="22"/>
         </w:rPr>
-        <w:t>2. Rada rozpatruje skargę w terminie 30 dni; w sprawach złożonych — 60 dni.</w:t>
+        <w:t>2. Skargi rozpatruje się na zasadach określonych w Koronnym Kodeksie Postępowania Administracyjnego.</w:t>
       </w:r>
     </w:p>
     <w:p>
@@ -8025,6 +7770,16 @@
       </w:rPr>
       <w:t>55</w:t>
     </w:r>
+  </w:p>
+</w:hdr>
+</file>
+
+<file path=word/header3.xml><?xml version="1.0" encoding="utf-8"?>
+<w:hdr xmlns:m="http://schemas.openxmlformats.org/officeDocument/2006/math" xmlns:mc="http://schemas.openxmlformats.org/markup-compatibility/2006" xmlns:mo="http://schemas.microsoft.com/office/mac/office/2008/main" xmlns:mv="urn:schemas-microsoft-com:mac:vml" xmlns:o="urn:schemas-microsoft-com:office:office" xmlns:r="http://schemas.openxmlformats.org/officeDocument/2006/relationships" xmlns:v="urn:schemas-microsoft-com:vml" xmlns:w10="urn:schemas-microsoft-com:office:word" xmlns:w14="http://schemas.microsoft.com/office/word/2010/wordml" xmlns:w="http://schemas.openxmlformats.org/wordprocessingml/2006/main" xmlns:wne="http://schemas.microsoft.com/office/word/2006/wordml" xmlns:wp14="http://schemas.microsoft.com/office/word/2010/wordprocessingDrawing" xmlns:wp="http://schemas.openxmlformats.org/drawingml/2006/wordprocessingDrawing" xmlns:wpc="http://schemas.microsoft.com/office/word/2010/wordprocessingCanvas" xmlns:wpg="http://schemas.microsoft.com/office/word/2010/wordprocessingGroup" xmlns:wpi="http://schemas.microsoft.com/office/word/2010/wordprocessingInk" xmlns:wps="http://schemas.microsoft.com/office/word/2010/wordprocessingShape" mc:Ignorable="w14 wp14">
+  <w:p>
+    <w:pPr>
+      <w:pStyle w:val="Header"/>
+    </w:pPr>
   </w:p>
 </w:hdr>
 </file>

</xml_diff>